<commit_message>
docs: cap nhat noi dung va chinh sua hoan thien 4 file docx Chuyen de
</commit_message>
<xml_diff>
--- a/CHUYENDE/Chuyên Đề 1 UXUI.docx
+++ b/CHUYENDE/Chuyên Đề 1 UXUI.docx
@@ -863,7 +863,7 @@
                 <w:szCs w:val="24"/>
                 <w:lang w:val="vi-VN"/>
               </w:rPr>
-              <w:t>Huỳnh Trung tính</w:t>
+              <w:t>Huỳnh Trung Tính</w:t>
             </w:r>
           </w:p>
         </w:tc>
@@ -1080,7 +1080,7 @@
           <w:szCs w:val="26"/>
           <w:lang w:val="vi-VN"/>
         </w:rPr>
-        <w:t>Chuyên đề tập trung nghiên cứu và đánh giá các nền tảng và công nghệ phục vụ thiết kế UI/UX cho hệ thống quản lý tuyển dụng, bao gồm:</w:t>
+        <w:t>Chuyên đề tập trung nghiên cứu và đánh giá các nền tảng và công nghệ phục vụ thiết kế UI/UX cho hệ thống quản lý trường học, bao gồm:</w:t>
       </w:r>
     </w:p>
     <w:p>
@@ -2044,7 +2044,7 @@
           <w:sz w:val="28"/>
           <w:szCs w:val="28"/>
         </w:rPr>
-        <w:t xml:space="preserve"> Vì người dùng thao tác bằng ngón tay thay vì con trỏ chuột chuột chính xác, mọi nút bấm, vùng chọn </w:t>
+        <w:t xml:space="preserve"> Vì người dùng thao tác bằng ngón tay thay vì con trỏ chuột chính xác, mọi nút bấm, vùng chọn </w:t>
       </w:r>
       <w:r>
         <w:rPr>

</xml_diff>